<commit_message>
State of Art 5th step
Academic Synthesis (StateOfArt.md)
</commit_message>
<xml_diff>
--- a/docs/ProgressReport.docx
+++ b/docs/ProgressReport.docx
@@ -131,6 +131,19 @@
           <w:lang w:val="fr-FR"/>
         </w:rPr>
         <w:t>Les résultats de cette recherche fourniront un cadre pour le suivi du confort lors de l'exécution de tâches, avec des applications dans la formation musicale et potentiellement dans le milieu industriel, où un travailleur effectuant une tâche pourrait être suivi de manière similaire. Ce projet établit un lien entre l'ingénierie, les neurosciences et l'étude de la performance humaine.</w:t>
+      </w:r>
+      <w:r>
+        <w:rPr>
+          <w:lang w:val="fr-FR"/>
+        </w:rPr>
+        <w:br/>
+      </w:r>
+      <w:r>
+        <w:rPr>
+          <w:lang w:val="fr-FR"/>
+        </w:rPr>
+        <w:br/>
+        <w:t>Ceci est la description large du projet, l’axe de mon travail sera un angle plus mince de ce quadrant.</w:t>
       </w:r>
     </w:p>
     <w:p>
@@ -928,43 +941,157 @@
         <w:rPr>
           <w:lang w:val="fr-BE"/>
         </w:rPr>
+        <w:t xml:space="preserve">Réunion avec Isabelle Cosette et </w:t>
+      </w:r>
+      <w:r>
+        <w:rPr>
+          <w:lang w:val="fr-BE"/>
+        </w:rPr>
+        <w:t xml:space="preserve">Liliana </w:t>
+      </w:r>
+      <w:proofErr w:type="spellStart"/>
+      <w:r>
+        <w:rPr>
+          <w:lang w:val="fr-BE"/>
+        </w:rPr>
+        <w:t>Araújo</w:t>
+      </w:r>
+      <w:proofErr w:type="spellEnd"/>
+      <w:r>
+        <w:rPr>
+          <w:lang w:val="fr-BE"/>
+        </w:rPr>
+        <w:t xml:space="preserve"> =&gt; Piste : utiliser le Performance Simulator</w:t>
+      </w:r>
+    </w:p>
+    <w:p>
+      <w:pPr>
+        <w:pStyle w:val="Titre2"/>
+        <w:rPr>
+          <w:lang w:val="fr-BE"/>
+        </w:rPr>
+      </w:pPr>
+      <w:r>
+        <w:rPr>
+          <w:lang w:val="fr-BE"/>
+        </w:rPr>
+        <w:lastRenderedPageBreak/>
+        <w:t>Semaine 4 :</w:t>
+      </w:r>
+    </w:p>
+    <w:p>
+      <w:pPr>
+        <w:pStyle w:val="Paragraphedeliste"/>
+        <w:numPr>
+          <w:ilvl w:val="0"/>
+          <w:numId w:val="2"/>
+        </w:numPr>
+        <w:rPr>
+          <w:lang w:val="fr-BE"/>
+        </w:rPr>
+      </w:pPr>
+      <w:r>
+        <w:rPr>
+          <w:lang w:val="fr-BE"/>
+        </w:rPr>
+        <w:t>Performance Simulator interface meeting</w:t>
+      </w:r>
+    </w:p>
+    <w:p>
+      <w:pPr>
+        <w:pStyle w:val="Paragraphedeliste"/>
+        <w:numPr>
+          <w:ilvl w:val="0"/>
+          <w:numId w:val="2"/>
+        </w:numPr>
+        <w:rPr>
+          <w:lang w:val="fr-BE"/>
+        </w:rPr>
+      </w:pPr>
+      <w:r>
+        <w:rPr>
+          <w:lang w:val="fr-BE"/>
+        </w:rPr>
+        <w:t xml:space="preserve">Workshop </w:t>
+      </w:r>
+      <w:proofErr w:type="spellStart"/>
+      <w:r>
+        <w:rPr>
+          <w:lang w:val="fr-BE"/>
+        </w:rPr>
+        <w:t>MoCap</w:t>
+      </w:r>
+      <w:proofErr w:type="spellEnd"/>
+    </w:p>
+    <w:p>
+      <w:pPr>
+        <w:pStyle w:val="Paragraphedeliste"/>
+        <w:numPr>
+          <w:ilvl w:val="0"/>
+          <w:numId w:val="2"/>
+        </w:numPr>
+        <w:rPr>
+          <w:lang w:val="fr-BE"/>
+        </w:rPr>
+      </w:pPr>
+      <w:r>
+        <w:rPr>
+          <w:lang w:val="fr-BE"/>
+        </w:rPr>
+        <w:t xml:space="preserve">State of the Art </w:t>
+      </w:r>
+      <w:proofErr w:type="spellStart"/>
+      <w:r>
+        <w:rPr>
+          <w:lang w:val="fr-BE"/>
+        </w:rPr>
+        <w:t>synthesis</w:t>
+      </w:r>
+      <w:proofErr w:type="spellEnd"/>
+      <w:r>
+        <w:rPr>
+          <w:lang w:val="fr-BE"/>
+        </w:rPr>
+        <w:t xml:space="preserve"> (voir StateOfArt.md)</w:t>
+      </w:r>
+    </w:p>
+    <w:p>
+      <w:pPr>
+        <w:pStyle w:val="Paragraphedeliste"/>
+        <w:numPr>
+          <w:ilvl w:val="0"/>
+          <w:numId w:val="2"/>
+        </w:numPr>
+        <w:rPr>
+          <w:lang w:val="fr-BE"/>
+        </w:rPr>
+      </w:pPr>
+      <w:r>
+        <w:rPr>
+          <w:lang w:val="fr-BE"/>
+        </w:rPr>
         <w:t>Découverte des labos et des outils de mesures</w:t>
+      </w:r>
+    </w:p>
+    <w:p>
+      <w:pPr>
+        <w:pStyle w:val="Paragraphedeliste"/>
+        <w:numPr>
+          <w:ilvl w:val="0"/>
+          <w:numId w:val="2"/>
+        </w:numPr>
+        <w:rPr>
+          <w:lang w:val="fr-BE"/>
+        </w:rPr>
+      </w:pPr>
+      <w:r>
+        <w:rPr>
+          <w:lang w:val="fr-BE"/>
+        </w:rPr>
+        <w:t>Validation de l’axe et de la question de recherche</w:t>
       </w:r>
       <w:bookmarkStart w:id="0" w:name="_GoBack"/>
       <w:bookmarkEnd w:id="0"/>
-    </w:p>
-    <w:p>
-      <w:pPr>
-        <w:pStyle w:val="Titre2"/>
-        <w:rPr>
-          <w:lang w:val="fr-BE"/>
-        </w:rPr>
-      </w:pPr>
-      <w:r>
-        <w:rPr>
-          <w:lang w:val="fr-BE"/>
-        </w:rPr>
-        <w:lastRenderedPageBreak/>
-        <w:t>Semaine 4 :</w:t>
-      </w:r>
-    </w:p>
-    <w:p>
-      <w:pPr>
-        <w:pStyle w:val="Paragraphedeliste"/>
-        <w:numPr>
-          <w:ilvl w:val="0"/>
-          <w:numId w:val="2"/>
-        </w:numPr>
-        <w:rPr>
-          <w:lang w:val="fr-BE"/>
-        </w:rPr>
-      </w:pPr>
-      <w:r>
-        <w:rPr>
-          <w:lang w:val="fr-BE"/>
-        </w:rPr>
-        <w:t>Validation de l’axe et de la question de recherche</w:t>
-      </w:r>
     </w:p>
     <w:sectPr>
       <w:headerReference w:type="default" r:id="rId9"/>

</xml_diff>